<commit_message>
style: set report titles to black
</commit_message>
<xml_diff>
--- a/reports/ejercicio_05_informe.docx
+++ b/reports/ejercicio_05_informe.docx
@@ -11,7 +11,7 @@
         <w:rPr>
           <w:rFonts w:ascii="Arial" w:hAnsi="Arial"/>
           <w:b/>
-          <w:color w:val="17365D"/>
+          <w:color w:val="000000"/>
           <w:sz w:val="38"/>
         </w:rPr>
         <w:t>Ejercicio 05</w:t>
@@ -37,6 +37,9 @@
         <w:pStyle w:val="Heading2"/>
       </w:pPr>
       <w:r>
+        <w:rPr>
+          <w:color w:val="000000"/>
+        </w:rPr>
         <w:t>Repositorio y entrega</w:t>
       </w:r>
     </w:p>
@@ -63,6 +66,9 @@
         <w:pStyle w:val="Heading2"/>
       </w:pPr>
       <w:r>
+        <w:rPr>
+          <w:color w:val="000000"/>
+        </w:rPr>
         <w:t>Datos y partición temporal</w:t>
       </w:r>
     </w:p>
@@ -89,6 +95,9 @@
         <w:pStyle w:val="Heading2"/>
       </w:pPr>
       <w:r>
+        <w:rPr>
+          <w:color w:val="000000"/>
+        </w:rPr>
         <w:t>Métodos y resultados principales</w:t>
       </w:r>
     </w:p>
@@ -1663,6 +1672,9 @@
         <w:pStyle w:val="Heading2"/>
       </w:pPr>
       <w:r>
+        <w:rPr>
+          <w:color w:val="000000"/>
+        </w:rPr>
         <w:t>Perfiles y usuarios fríos</w:t>
       </w:r>
     </w:p>
@@ -2163,6 +2175,9 @@
         <w:pStyle w:val="Heading2"/>
       </w:pPr>
       <w:r>
+        <w:rPr>
+          <w:color w:val="000000"/>
+        </w:rPr>
         <w:t>Comparación Pareto y decisión</w:t>
       </w:r>
     </w:p>
@@ -2180,6 +2195,9 @@
         <w:pStyle w:val="Heading2"/>
       </w:pPr>
       <w:r>
+        <w:rPr>
+          <w:color w:val="000000"/>
+        </w:rPr>
         <w:t>Errores, límites y reproducción</w:t>
       </w:r>
     </w:p>
@@ -2206,6 +2224,9 @@
         <w:pStyle w:val="Heading2"/>
       </w:pPr>
       <w:r>
+        <w:rPr>
+          <w:color w:val="000000"/>
+        </w:rPr>
         <w:t>Uso de IA y fuentes</w:t>
       </w:r>
     </w:p>
@@ -2672,7 +2693,7 @@
       <w:rFonts w:asciiTheme="majorHAnsi" w:eastAsiaTheme="majorEastAsia" w:hAnsiTheme="majorHAnsi" w:cstheme="majorBidi" w:ascii="Arial" w:hAnsi="Arial"/>
       <w:b/>
       <w:bCs/>
-      <w:color w:val="17365D"/>
+      <w:color w:val="000000"/>
       <w:sz w:val="28"/>
       <w:szCs w:val="28"/>
     </w:rPr>
@@ -2696,7 +2717,7 @@
       <w:rFonts w:asciiTheme="majorHAnsi" w:eastAsiaTheme="majorEastAsia" w:hAnsiTheme="majorHAnsi" w:cstheme="majorBidi" w:ascii="Arial" w:hAnsi="Arial"/>
       <w:b/>
       <w:bCs/>
-      <w:color w:val="17365D"/>
+      <w:color w:val="000000"/>
       <w:sz w:val="24"/>
       <w:szCs w:val="26"/>
     </w:rPr>
@@ -2720,7 +2741,7 @@
       <w:rFonts w:asciiTheme="majorHAnsi" w:eastAsiaTheme="majorEastAsia" w:hAnsiTheme="majorHAnsi" w:cstheme="majorBidi"/>
       <w:b/>
       <w:bCs/>
-      <w:color w:val="4F81BD" w:themeColor="accent1"/>
+      <w:color w:val="000000"/>
     </w:rPr>
   </w:style>
   <w:style w:type="paragraph" w:styleId="Heading4">

</xml_diff>